<commit_message>
cases: reorder sections — Discussion Questions now precedes Decision Framing Questions (renamed from Framing questions)
</commit_message>
<xml_diff>
--- a/assets/cases/Asterion_Clinical_Trial_Case.docx
+++ b/assets/cases/Asterion_Clinical_Trial_Case.docx
@@ -65,7 +65,10 @@
     </w:p>
     <w:p>
       <w:r>
-        <w:t>At 7:15 on a Tuesday morning in March 2027, Maya Chen, chief development officer of Asterion Therapeutics, opened the interim report for AST-417, an injectable therapy for progressive pulmonary fibrosis. The company had spent six years and $214 million moving the compound from laboratory work through two early clinical studies. Asterion now had enough evidence to believe the therapy could slow the loss of lung function, but not enough evidence to know whether the benefit would be clinically persuasive, durable, or broad enough to support approval.</w:t>
+        <w:t>At 7:15 on a Tuesday morning in March 2027, Maya Chen, chief development officer of Asterion Therapeutics, opened the interim report for AST-417, an injectable therapy for progressive pulmonary fibrosis. The company had spent six years and $214 million moving the compound from laboratory work through two early clinical studies. Asterion now had enough evidence to believe the therapy could slow the loss of lung function, but not enough evidence to know whether the benefit would be clinically persuasive, dura</w:t>
+      </w:r>
+      <w:r>
+        <w:t>ble, or broad enough to support approval.</w:t>
       </w:r>
     </w:p>
     <w:p>
@@ -552,13 +555,19 @@
     </w:p>
     <w:p>
       <w:r>
-        <w:t>AST-417 was intended for patients whose disease continued to progress despite existing therapy. The Phase IIb protocol measured change in forced vital capacity after 24 weeks, along with exercise tolerance, patient-reported breathing difficulty, hospitalizations, laboratory markers, and adverse events. Investigators had expected the high dose to show the clearest benefit. Instead, the low-dose group had produced the strongest average result, while the high-dose group included both dramatic responders and several patients who discontinued treatment.</w:t>
+        <w:t>AST-417 was intended for patients whose disease continued to progress despite existing therapy. The Phase IIb protocol measured change in forced vital capacity after 24 weeks, along with exercise tolerance, patient-reported breathing difficulty, hospitalizations, laboratory markers, and adverse events. Investigators had expected the high dose to show the clearest benefit. Instead, the low-dose group had produced the strongest average result, while the high-dose group included both dramatic responders and se</w:t>
+      </w:r>
+      <w:r>
+        <w:t>veral patients who discontinued treatment.</w:t>
       </w:r>
     </w:p>
     <w:p>
       <w:r>
         <w:lastRenderedPageBreak/>
-        <w:t>The averages concealed important differences. Patients diagnosed within the previous two years appeared to improve more than patients with advanced disease. Results also varied by region and by whether patients remained on background therapy. The subgroup findings were scientifically plausible, but the trial had not been designed to prove them. Narrowing the next study to the apparent responders could raise the probability of a positive result, but it could also reduce the potential market and make recruitment more difficult.</w:t>
+        <w:t>The averages concealed important differences. Patients diagnosed within the previous two years appeared to improve more than patients with advanced disease. Results also varied by region and by whether patients remained on background therapy. The subgroup findings were scientifically plausible, but the trial had not been designed to prove them. Narrowing the next study to the apparent responders could raise the probability of a positive result, but it could also reduce the potential market and make recruitm</w:t>
+      </w:r>
+      <w:r>
+        <w:t>ent more difficult.</w:t>
       </w:r>
     </w:p>
     <w:p>
@@ -1070,7 +1079,10 @@
     </w:p>
     <w:p>
       <w:r>
-        <w:t>The original plan assumed that each active site would enroll 0.55 patients per month. The actual rate was 0.31. Some hospitals screened many patients but enrolled few because the eligibility rules excluded people with kidney disease, recent infections, unstable background medication, or disease that was either too mild or too advanced. Community pulmonologists were reluctant to refer patients to academic centers, fearing that they would lose the long-term relationship. Patients faced repeated travel, invasive testing, and a one-in-three chance of receiving placebo.</w:t>
+        <w:t>The original plan assumed that each active site would enroll 0.55 patients per month. The actual rate was 0.31. Some hospitals screened many patients but enrolled few because the eligibility rules excluded people with kidney disease, recent infections, unstable background medication, or disease that was either too mild or too advanced. Community pulmonologists were reluctant to refer patients to academic centers, fearing that they would lose the long-term relationship. Patients faced repeated travel, invasi</w:t>
+      </w:r>
+      <w:r>
+        <w:t>ve testing, and a one-in-three chance of receiving placebo.</w:t>
       </w:r>
     </w:p>
     <w:p>
@@ -1975,7 +1987,10 @@
     </w:p>
     <w:p>
       <w:r>
-        <w:t>Even a successful trial would not settle the business problem. Existing treatments were taken orally, while AST-417 required an infusion every four weeks and refrigerated distribution. Asterion estimated that manufacturing, packaging, cold-chain distribution, and administration support would cost $14,600 per treated patient per year before sales, rebates, patient assistance, and post-approval studies. Physicians interviewed by the company liked the possibility of slower disease progression, but many said they would reserve an infusion for patients who had failed simpler treatments.</w:t>
+        <w:t>Even a successful trial would not settle the business problem. Existing treatments were taken orally, while AST-417 required an infusion every four weeks and refrigerated distribution. Asterion estimated that manufacturing, packaging, cold-chain distribution, and administration support would cost $14,600 per treated patient per year before sales, rebates, patient assistance, and post-approval studies. Physicians interviewed by the company liked the possibility of slower disease progression, but many said th</w:t>
+      </w:r>
+      <w:r>
+        <w:t>ey would reserve an infusion for patients who had failed simpler treatments.</w:t>
       </w:r>
     </w:p>
     <w:p>
@@ -2444,7 +2459,195 @@
         <w:pStyle w:val="Heading1"/>
       </w:pPr>
       <w:r>
-        <w:t>Framing questions</w:t>
+        <w:t>Discussion Questions</w:t>
+      </w:r>
+    </w:p>
+    <w:p>
+      <w:pPr>
+        <w:pStyle w:val="DiscussionQuestion"/>
+        <w:numPr>
+          <w:ilvl w:val="0"/>
+          <w:numId w:val="12"/>
+        </w:numPr>
+        <w:rPr>
+          <w:sz w:val="22"/>
+        </w:rPr>
+      </w:pPr>
+      <w:r>
+        <w:rPr>
+          <w:sz w:val="22"/>
+        </w:rPr>
+        <w:t>What should Chen recommend at the Thursday board meeting?</w:t>
+      </w:r>
+    </w:p>
+    <w:p>
+      <w:pPr>
+        <w:pStyle w:val="DiscussionQuestion"/>
+        <w:numPr>
+          <w:ilvl w:val="0"/>
+          <w:numId w:val="12"/>
+        </w:numPr>
+        <w:rPr>
+          <w:sz w:val="22"/>
+        </w:rPr>
+      </w:pPr>
+      <w:r>
+        <w:rPr>
+          <w:sz w:val="22"/>
+        </w:rPr>
+        <w:t>How should Asterion interpret the stronger low-dose result and the uneven high-dose response?</w:t>
+      </w:r>
+    </w:p>
+    <w:p>
+      <w:pPr>
+        <w:pStyle w:val="DiscussionQuestion"/>
+        <w:numPr>
+          <w:ilvl w:val="0"/>
+          <w:numId w:val="12"/>
+        </w:numPr>
+        <w:rPr>
+          <w:sz w:val="22"/>
+        </w:rPr>
+      </w:pPr>
+      <w:r>
+        <w:rPr>
+          <w:sz w:val="22"/>
+        </w:rPr>
+        <w:t>Should the next study use a broad population or focus on recently diagnosed patients?</w:t>
+      </w:r>
+    </w:p>
+    <w:p>
+      <w:pPr>
+        <w:pStyle w:val="DiscussionQuestion"/>
+        <w:numPr>
+          <w:ilvl w:val="0"/>
+          <w:numId w:val="12"/>
+        </w:numPr>
+        <w:rPr>
+          <w:sz w:val="22"/>
+        </w:rPr>
+      </w:pPr>
+      <w:r>
+        <w:rPr>
+          <w:sz w:val="22"/>
+        </w:rPr>
+        <w:t>How should the company balance enrollment speed against site quality and data consistency?</w:t>
+      </w:r>
+    </w:p>
+    <w:p>
+      <w:pPr>
+        <w:pStyle w:val="DiscussionQuestion"/>
+        <w:numPr>
+          <w:ilvl w:val="0"/>
+          <w:numId w:val="12"/>
+        </w:numPr>
+        <w:rPr>
+          <w:sz w:val="22"/>
+        </w:rPr>
+      </w:pPr>
+      <w:r>
+        <w:rPr>
+          <w:sz w:val="22"/>
+        </w:rPr>
+        <w:t>Which proposed recruitment investments are most likely to produce useful information rather than merely more activity?</w:t>
+      </w:r>
+    </w:p>
+    <w:p>
+      <w:pPr>
+        <w:pStyle w:val="DiscussionQuestion"/>
+        <w:numPr>
+          <w:ilvl w:val="0"/>
+          <w:numId w:val="12"/>
+        </w:numPr>
+        <w:rPr>
+          <w:sz w:val="22"/>
+        </w:rPr>
+      </w:pPr>
+      <w:r>
+        <w:rPr>
+          <w:sz w:val="22"/>
+        </w:rPr>
+        <w:t>What evidence should trigger continuation, expansion, redesign, partnership, or termination?</w:t>
+      </w:r>
+    </w:p>
+    <w:p>
+      <w:pPr>
+        <w:pStyle w:val="DiscussionQuestion"/>
+        <w:numPr>
+          <w:ilvl w:val="0"/>
+          <w:numId w:val="12"/>
+        </w:numPr>
+        <w:rPr>
+          <w:sz w:val="22"/>
+        </w:rPr>
+      </w:pPr>
+      <w:r>
+        <w:rPr>
+          <w:sz w:val="22"/>
+        </w:rPr>
+        <w:t>How should safety signals be incorporated when the independent committee has not recommended stopping?</w:t>
+      </w:r>
+    </w:p>
+    <w:p>
+      <w:pPr>
+        <w:pStyle w:val="DiscussionQuestion"/>
+        <w:numPr>
+          <w:ilvl w:val="0"/>
+          <w:numId w:val="12"/>
+        </w:numPr>
+        <w:rPr>
+          <w:sz w:val="22"/>
+        </w:rPr>
+      </w:pPr>
+      <w:r>
+        <w:rPr>
+          <w:sz w:val="22"/>
+        </w:rPr>
+        <w:t>How much should commercial forecasts influence the design and continuation of the clinical program?</w:t>
+      </w:r>
+    </w:p>
+    <w:p>
+      <w:pPr>
+        <w:pStyle w:val="DiscussionQuestion"/>
+        <w:numPr>
+          <w:ilvl w:val="0"/>
+          <w:numId w:val="12"/>
+        </w:numPr>
+        <w:rPr>
+          <w:sz w:val="22"/>
+        </w:rPr>
+      </w:pPr>
+      <w:r>
+        <w:rPr>
+          <w:sz w:val="22"/>
+        </w:rPr>
+        <w:t>What information would have the greatest value before Asterion commits to a pivotal trial?</w:t>
+      </w:r>
+    </w:p>
+    <w:p>
+      <w:pPr>
+        <w:pStyle w:val="DiscussionQuestion"/>
+        <w:numPr>
+          <w:ilvl w:val="0"/>
+          <w:numId w:val="12"/>
+        </w:numPr>
+        <w:rPr>
+          <w:sz w:val="22"/>
+        </w:rPr>
+      </w:pPr>
+      <w:r>
+        <w:rPr>
+          <w:sz w:val="22"/>
+        </w:rPr>
+        <w:t>How should management communicate an ambiguous decision to patients, investigators, employees, and investors?</w:t>
+      </w:r>
+    </w:p>
+    <w:p>
+      <w:pPr>
+        <w:pStyle w:val="Heading1"/>
+      </w:pPr>
+      <w:r>
+        <w:t>Decision Framing Questions</w:t>
       </w:r>
     </w:p>
     <w:p>
@@ -2456,15 +2659,7 @@
         </w:numPr>
       </w:pPr>
       <w:r>
-        <w:t xml:space="preserve">Identify the different metrics that can be used to evaluate every aspect of the performance of the system?  Organize these into a pyramid to indicate </w:t>
-      </w:r>
-      <w:proofErr w:type="gramStart"/>
-      <w:r>
-        <w:t>the relative</w:t>
-      </w:r>
-      <w:proofErr w:type="gramEnd"/>
-      <w:r>
-        <w:t xml:space="preserve"> importance, following the style given here.</w:t>
+        <w:t>Identify the different metrics that can be used to evaluate every aspect of the performance of the system?  Organize these into a pyramid to indicate the relative importance, following the style given here.</w:t>
       </w:r>
     </w:p>
     <w:p>
@@ -2616,7 +2811,11 @@
         </w:numPr>
       </w:pPr>
       <w:r>
-        <w:t>What data appears to be necessary to make this decision, including the calculation of any performance metrics where the decision would have a high or medium impact.</w:t>
+        <w:t>What data appears to</w:t>
+      </w:r>
+      <w:r>
+        <w:lastRenderedPageBreak/>
+        <w:t xml:space="preserve"> be necessary to make this decision, including the calculation of any performance metrics where the decision would have a high or medium impact.</w:t>
       </w:r>
     </w:p>
     <w:p>
@@ -2628,204 +2827,7 @@
         </w:numPr>
       </w:pPr>
       <w:r>
-        <w:t xml:space="preserve">Using the same </w:t>
-      </w:r>
-      <w:proofErr w:type="gramStart"/>
-      <w:r>
-        <w:t>decision</w:t>
-      </w:r>
-      <w:proofErr w:type="gramEnd"/>
-      <w:r>
-        <w:t xml:space="preserve"> you identified in (6), identify the people, departments, groups or organizations that you would need to work with to implement the decision?</w:t>
-      </w:r>
-    </w:p>
-    <w:p>
-      <w:pPr>
-        <w:pStyle w:val="Heading1"/>
-      </w:pPr>
-      <w:r>
-        <w:t>Discussion Questions</w:t>
-      </w:r>
-    </w:p>
-    <w:p>
-      <w:pPr>
-        <w:pStyle w:val="DiscussionQuestion"/>
-        <w:numPr>
-          <w:ilvl w:val="0"/>
-          <w:numId w:val="12"/>
-        </w:numPr>
-        <w:rPr>
-          <w:sz w:val="22"/>
-        </w:rPr>
-      </w:pPr>
-      <w:r>
-        <w:rPr>
-          <w:sz w:val="22"/>
-        </w:rPr>
-        <w:t>What should Chen recommend at the Thursday board meeting?</w:t>
-      </w:r>
-    </w:p>
-    <w:p>
-      <w:pPr>
-        <w:pStyle w:val="DiscussionQuestion"/>
-        <w:numPr>
-          <w:ilvl w:val="0"/>
-          <w:numId w:val="12"/>
-        </w:numPr>
-        <w:rPr>
-          <w:sz w:val="22"/>
-        </w:rPr>
-      </w:pPr>
-      <w:r>
-        <w:rPr>
-          <w:sz w:val="22"/>
-        </w:rPr>
-        <w:t>How should Asterion interpret the stronger low-dose result and the uneven high-dose response?</w:t>
-      </w:r>
-    </w:p>
-    <w:p>
-      <w:pPr>
-        <w:pStyle w:val="DiscussionQuestion"/>
-        <w:numPr>
-          <w:ilvl w:val="0"/>
-          <w:numId w:val="12"/>
-        </w:numPr>
-        <w:rPr>
-          <w:sz w:val="22"/>
-        </w:rPr>
-      </w:pPr>
-      <w:r>
-        <w:rPr>
-          <w:sz w:val="22"/>
-        </w:rPr>
-        <w:t>Should the next study use a broad population or focus on recently diagnosed patients?</w:t>
-      </w:r>
-    </w:p>
-    <w:p>
-      <w:pPr>
-        <w:pStyle w:val="DiscussionQuestion"/>
-        <w:numPr>
-          <w:ilvl w:val="0"/>
-          <w:numId w:val="12"/>
-        </w:numPr>
-        <w:rPr>
-          <w:sz w:val="22"/>
-        </w:rPr>
-      </w:pPr>
-      <w:r>
-        <w:rPr>
-          <w:sz w:val="22"/>
-        </w:rPr>
-        <w:t>How should the company balance enrollment speed against site quality and data consistency?</w:t>
-      </w:r>
-    </w:p>
-    <w:p>
-      <w:pPr>
-        <w:pStyle w:val="DiscussionQuestion"/>
-        <w:numPr>
-          <w:ilvl w:val="0"/>
-          <w:numId w:val="12"/>
-        </w:numPr>
-        <w:rPr>
-          <w:sz w:val="22"/>
-        </w:rPr>
-      </w:pPr>
-      <w:r>
-        <w:rPr>
-          <w:sz w:val="22"/>
-        </w:rPr>
-        <w:t>Which proposed recruitment investments are most likely to produce useful information rather than merely more activity?</w:t>
-      </w:r>
-    </w:p>
-    <w:p>
-      <w:pPr>
-        <w:pStyle w:val="DiscussionQuestion"/>
-        <w:numPr>
-          <w:ilvl w:val="0"/>
-          <w:numId w:val="12"/>
-        </w:numPr>
-        <w:rPr>
-          <w:sz w:val="22"/>
-        </w:rPr>
-      </w:pPr>
-      <w:r>
-        <w:rPr>
-          <w:sz w:val="22"/>
-        </w:rPr>
-        <w:t>What evidence should trigger continuation, expansion, redesign, partnership, or termination?</w:t>
-      </w:r>
-    </w:p>
-    <w:p>
-      <w:pPr>
-        <w:pStyle w:val="DiscussionQuestion"/>
-        <w:numPr>
-          <w:ilvl w:val="0"/>
-          <w:numId w:val="12"/>
-        </w:numPr>
-        <w:rPr>
-          <w:sz w:val="22"/>
-        </w:rPr>
-      </w:pPr>
-      <w:r>
-        <w:rPr>
-          <w:sz w:val="22"/>
-        </w:rPr>
-        <w:t>How should safety signals be incorporated when the independent committee has not recommended stopping?</w:t>
-      </w:r>
-    </w:p>
-    <w:p>
-      <w:pPr>
-        <w:pStyle w:val="DiscussionQuestion"/>
-        <w:numPr>
-          <w:ilvl w:val="0"/>
-          <w:numId w:val="12"/>
-        </w:numPr>
-        <w:rPr>
-          <w:sz w:val="22"/>
-        </w:rPr>
-      </w:pPr>
-      <w:r>
-        <w:rPr>
-          <w:sz w:val="22"/>
-        </w:rPr>
-        <w:lastRenderedPageBreak/>
-        <w:t>How much should commercial forecasts influence the design and continuation of the clinical program?</w:t>
-      </w:r>
-    </w:p>
-    <w:p>
-      <w:pPr>
-        <w:pStyle w:val="DiscussionQuestion"/>
-        <w:numPr>
-          <w:ilvl w:val="0"/>
-          <w:numId w:val="12"/>
-        </w:numPr>
-        <w:rPr>
-          <w:sz w:val="22"/>
-        </w:rPr>
-      </w:pPr>
-      <w:r>
-        <w:rPr>
-          <w:sz w:val="22"/>
-        </w:rPr>
-        <w:t>What information would have the greatest value before Asterion commits to a pivotal trial?</w:t>
-      </w:r>
-    </w:p>
-    <w:p>
-      <w:pPr>
-        <w:pStyle w:val="DiscussionQuestion"/>
-        <w:numPr>
-          <w:ilvl w:val="0"/>
-          <w:numId w:val="12"/>
-        </w:numPr>
-        <w:rPr>
-          <w:sz w:val="22"/>
-        </w:rPr>
-      </w:pPr>
-      <w:r>
-        <w:rPr>
-          <w:sz w:val="22"/>
-        </w:rPr>
-        <w:t>How should management communicate an ambiguous decision to patients, investigators, employees, and investors?</w:t>
+        <w:t>Using the same decision you identified in (6), identify the people, departments, groups or organizations that you would need to work with to implement the decision?</w:t>
       </w:r>
     </w:p>
     <w:p>
@@ -2841,7 +2843,10 @@
         <w:pStyle w:val="SourceNoteText"/>
       </w:pPr>
       <w:r>
-        <w:t>Public context: ClinicalTrials.gov reported 595,847 registered studies as of July 2026. The U.S. Food and Drug Administration describes Phase III studies as commonly enrolling 300 to 3,000 participants and lasting one to four years. A published analysis of randomized surgical trials found a median completion delay of 12.2 months among delayed completed trials, while multiple studies identify inadequate recruitment as a leading reason trials are discontinued or fail to answer their primary question. Conceptual foundation: Warren B. Powell, Bridging Decision Problems, Volume I, Chapter 2, section “Running clinical trials for drug testing.” Sources accessed July 30, 2026: ClinicalTrials.gov, Trends and Charts on Registered Studies; U.S. Food and Drug Administration, Step 3: Clinical Research; Shadbolt et al., JAMA Network Open (2023); Briel et al., Journal of Clinical Epidemiology (2017).</w:t>
+        <w:t>Public context: ClinicalTrials.gov reported 595,847 registered studies as of July 2026. The U.S. Food and Drug Administration describes Phase III studies as commonly enrolling 300 to 3,000 participants and lasting one to four years. A published analysis of randomized surgical trials found a median completion delay of 12.2 months among delayed completed trials, while multiple studies identify inadequate recruitment as a leading reason trials are discontinued or fail to answer their primary question. Conceptu</w:t>
+      </w:r>
+      <w:r>
+        <w:t>al foundation: Warren B. Powell, Bridging Decision Problems, Volume I, Chapter 2, section “Running clinical trials for drug testing.” Sources accessed July 30, 2026: ClinicalTrials.gov, Trends and Charts on Registered Studies; U.S. Food and Drug Administration, Step 3: Clinical Research; Shadbolt et al., JAMA Network Open (2023); Briel et al., Journal of Clinical Epidemiology (2017).</w:t>
       </w:r>
     </w:p>
     <w:p>
@@ -2862,15 +2867,7 @@
     </w:p>
     <w:p>
       <w:r>
-        <w:t xml:space="preserve">Write a </w:t>
-      </w:r>
-      <w:proofErr w:type="gramStart"/>
-      <w:r>
-        <w:t>4-6 page</w:t>
-      </w:r>
-      <w:proofErr w:type="gramEnd"/>
-      <w:r>
-        <w:t xml:space="preserve"> case study based on the material in the section at https://warrenpowell.org/bridging-vol1/chapter-2/#clinicaltrials. Create a context based on the metrics, decisions and uncertainties in the section, but without explicitly calling attention to them. motivate your case problem with data.</w:t>
+        <w:t>Write a 4-6 page case study based on the material in the section at https://warrenpowell.org/bridging-vol1/chapter-2/#clinicaltrials. Create a context based on the metrics, decisions and uncertainties in the section, but without explicitly calling attention to them. motivate your case problem with data.</w:t>
       </w:r>
     </w:p>
     <w:p/>
@@ -4065,6 +4062,7 @@
   <w:style w:type="character" w:default="1" w:styleId="DefaultParagraphFont">
     <w:name w:val="Default Paragraph Font"/>
     <w:uiPriority w:val="1"/>
+    <w:semiHidden/>
     <w:unhideWhenUsed/>
   </w:style>
   <w:style w:type="table" w:default="1" w:styleId="TableNormal">

</xml_diff>

<commit_message>
cases: refresh Asterion Clinical Trial with the new Decision Framing Questions
</commit_message>
<xml_diff>
--- a/assets/cases/Asterion_Clinical_Trial_Case.docx
+++ b/assets/cases/Asterion_Clinical_Trial_Case.docx
@@ -2659,7 +2659,7 @@
         </w:numPr>
       </w:pPr>
       <w:r>
-        <w:t>Identify the different metrics that can be used to evaluate every aspect of the performance of the system?  Organize these into a pyramid to indicate the relative importance, following the style given here.</w:t>
+        <w:t xml:space="preserve">Identify and describe the responsibilities of the decision maker. This should set the scope of the problem.</w:t>
       </w:r>
     </w:p>
     <w:p>
@@ -2671,29 +2671,18 @@
         </w:numPr>
       </w:pPr>
       <w:r>
-        <w:t xml:space="preserve">What are the types of decisions? Use the </w:t>
+        <w:t xml:space="preserve">Use the </w:t>
       </w:r>
-      <w:hyperlink r:id="rId8" w:anchor="types-of-decision-settings" w:history="1">
+      <w:hyperlink r:id="rId16">
         <w:r>
           <w:rPr>
             <w:rStyle w:val="Hyperlink"/>
           </w:rPr>
-          <w:t>list of decision types here as a guide</w:t>
+          <w:t xml:space="preserve">metrics pyramid tool</w:t>
         </w:r>
       </w:hyperlink>
       <w:r>
-        <w:t xml:space="preserve">, illustrated by the </w:t>
-      </w:r>
-      <w:hyperlink r:id="rId9" w:anchor="from-apps-to-types" w:history="1">
-        <w:r>
-          <w:rPr>
-            <w:rStyle w:val="Hyperlink"/>
-          </w:rPr>
-          <w:t>applications here</w:t>
-        </w:r>
-      </w:hyperlink>
-      <w:r>
-        <w:t xml:space="preserve">.  </w:t>
+        <w:t xml:space="preserve"> to identify and prioritize the different performance metrics. Click on the oval holding the metric to identify whether it is a metric to be maximized (green), minimized (red), a target that is a floor (light green) or a ceiling (light red), or finally a target (purple).</w:t>
       </w:r>
     </w:p>
     <w:p>
@@ -2707,16 +2696,27 @@
       <w:r>
         <w:t xml:space="preserve">Use the </w:t>
       </w:r>
-      <w:hyperlink r:id="rId10" w:history="1">
+      <w:hyperlink r:id="rId17">
         <w:r>
           <w:rPr>
             <w:rStyle w:val="Hyperlink"/>
           </w:rPr>
-          <w:t>interactive framing matrix here</w:t>
+          <w:t xml:space="preserve">decision prioritization tool</w:t>
         </w:r>
       </w:hyperlink>
       <w:r>
-        <w:t xml:space="preserve"> to fill out the performance metrics along the top (from most to least important) followed by the list of decisions (in any order).  Use your judgment to assess whether the impact of each decision on each metric is H (high impact), M (medium), L (low) or N (none).  Finally, use the resulting matrix to rank the decisions in terms of their impact on the most important metrics.</w:t>
+        <w:t xml:space="preserve"> to first list the different types of decisions (use the </w:t>
+      </w:r>
+      <w:hyperlink r:id="rId18">
+        <w:r>
+          <w:rPr>
+            <w:rStyle w:val="Hyperlink"/>
+          </w:rPr>
+          <w:t xml:space="preserve">types of decisions</w:t>
+        </w:r>
+      </w:hyperlink>
+      <w:r>
+        <w:t xml:space="preserve"> as a guide). These will then populate the rows of the matrix to the right, where the columns are the performance metrics sorted left to right by the priority in the pyramid above. Click on each cell to indicate if the impact of the decision on each metric is high (red), medium (orange), low (yellow) or none (white).</w:t>
       </w:r>
     </w:p>
     <w:p>
@@ -2728,18 +2728,7 @@
         </w:numPr>
       </w:pPr>
       <w:r>
-        <w:t xml:space="preserve">What are the different sources of uncertainty?  Use the </w:t>
-      </w:r>
-      <w:hyperlink r:id="rId11" w:anchor="categories" w:history="1">
-        <w:r>
-          <w:rPr>
-            <w:rStyle w:val="Hyperlink"/>
-          </w:rPr>
-          <w:t>12 categories of uncertainty here as a guide</w:t>
-        </w:r>
-      </w:hyperlink>
-      <w:r>
-        <w:t>.</w:t>
+        <w:t xml:space="preserve">You can grab the handle (three bars) farthest to the left on each row to move it up or down. Sort the rows so that the decisions with the greatest impact on the most important metrics are toward the top. The cells in the upper left-hand corner should have the greatest concentration of red and orange cells. At this point identify the decisions that should receive the most attention in your study. If you do not have any decisions with a medium or high impact on the most important metrics, revisit your list of decisions.</w:t>
       </w:r>
     </w:p>
     <w:p>
@@ -2751,7 +2740,30 @@
         </w:numPr>
       </w:pPr>
       <w:r>
-        <w:t>Repeat the exercise in (3), but this time using uncertainties instead of decisions.</w:t>
+        <w:t xml:space="preserve">Repeat the process to list and prioritize the uncertainties. Use the </w:t>
+      </w:r>
+      <w:hyperlink r:id="rId19">
+        <w:r>
+          <w:rPr>
+            <w:rStyle w:val="Hyperlink"/>
+          </w:rPr>
+          <w:t xml:space="preserve">categories of uncertainty</w:t>
+        </w:r>
+      </w:hyperlink>
+      <w:r>
+        <w:t xml:space="preserve"> to help you identify these.</w:t>
+      </w:r>
+    </w:p>
+    <w:p>
+      <w:pPr>
+        <w:pStyle w:val="ListParagraph"/>
+        <w:numPr>
+          <w:ilvl w:val="0"/>
+          <w:numId w:val="10"/>
+        </w:numPr>
+      </w:pPr>
+      <w:r>
+        <w:t xml:space="preserve">It is important to differentiate uncertainties that can be evaluated on average, or as risk events:</w:t>
       </w:r>
     </w:p>
     <w:p>
@@ -2763,7 +2775,7 @@
         </w:numPr>
       </w:pPr>
       <w:r>
-        <w:t>Which sources of uncertainty would be captured using average performance over time?</w:t>
+        <w:t xml:space="preserve">Which sources of uncertainty would be captured using average performance over time?</w:t>
       </w:r>
     </w:p>
     <w:p>
@@ -2775,7 +2787,7 @@
         </w:numPr>
       </w:pPr>
       <w:r>
-        <w:t>Which sources of uncertainty represent forms of risk that are not properly captured using averages?</w:t>
+        <w:t xml:space="preserve">Which sources of uncertainty represent forms of risk that are not properly captured using averages?</w:t>
       </w:r>
     </w:p>
     <w:p>
@@ -2787,7 +2799,7 @@
         </w:numPr>
       </w:pPr>
       <w:r>
-        <w:t xml:space="preserve">Choose the single decision that seems to have the highest impact on the most important metric.  </w:t>
+        <w:t xml:space="preserve">Choose the single decision that seems to have the highest impact on the most important metric.</w:t>
       </w:r>
     </w:p>
     <w:p>
@@ -2799,7 +2811,7 @@
         </w:numPr>
       </w:pPr>
       <w:r>
-        <w:t>What approach do you think you would use to make this decision?</w:t>
+        <w:t xml:space="preserve">What approach do you think you would use to make this decision?</w:t>
       </w:r>
     </w:p>
     <w:p>
@@ -2811,11 +2823,7 @@
         </w:numPr>
       </w:pPr>
       <w:r>
-        <w:t>What data appears to</w:t>
-      </w:r>
-      <w:r>
-        <w:lastRenderedPageBreak/>
-        <w:t xml:space="preserve"> be necessary to make this decision, including the calculation of any performance metrics where the decision would have a high or medium impact.</w:t>
+        <w:t xml:space="preserve">What data appears to be necessary to make this decision, including the calculation of any performance metrics where the decision would have a high or medium impact.</w:t>
       </w:r>
     </w:p>
     <w:p>
@@ -2827,7 +2835,7 @@
         </w:numPr>
       </w:pPr>
       <w:r>
-        <w:t>Using the same decision you identified in (6), identify the people, departments, groups or organizations that you would need to work with to implement the decision?</w:t>
+        <w:t xml:space="preserve">Using the same decision you identified in (7), identify the people, departments, groups or organizations that you would need to work with to implement the decision.</w:t>
       </w:r>
     </w:p>
     <w:p>

</xml_diff>

<commit_message>
framing questions: Q5 now points at the uncertainty prioritization tool
</commit_message>
<xml_diff>
--- a/assets/cases/Asterion_Clinical_Trial_Case.docx
+++ b/assets/cases/Asterion_Clinical_Trial_Case.docx
@@ -2740,9 +2740,20 @@
         </w:numPr>
       </w:pPr>
       <w:r>
-        <w:t xml:space="preserve">Repeat the process to list and prioritize the uncertainties. Use the </w:t>
+        <w:t xml:space="preserve">Repeat the process to list and prioritize the uncertainties using the </w:t>
       </w:r>
       <w:hyperlink r:id="rId19">
+        <w:r>
+          <w:rPr>
+            <w:rStyle w:val="Hyperlink"/>
+          </w:rPr>
+          <w:t xml:space="preserve">uncertainty prioritization tool</w:t>
+        </w:r>
+      </w:hyperlink>
+      <w:r>
+        <w:t xml:space="preserve">. Use the </w:t>
+      </w:r>
+      <w:hyperlink r:id="rId20">
         <w:r>
           <w:rPr>
             <w:rStyle w:val="Hyperlink"/>

</xml_diff>